<commit_message>
added some more docs
</commit_message>
<xml_diff>
--- a/docs/TheLizberries/informazioni da aggiungere.docx
+++ b/docs/TheLizberries/informazioni da aggiungere.docx
@@ -12,21 +12,35 @@
           <w:kern w:val="0"/>
           <w:sz w:val="24"/>
           <w:szCs w:val="24"/>
-          <w:lang w:eastAsia="it-IT"/>
+          <w:lang w:val="en-GB" w:eastAsia="it-IT"/>
           <w14:ligatures w14:val="none"/>
         </w:rPr>
       </w:pPr>
-      <w:r>
-        <w:rPr>
-          <w:rFonts w:ascii="Arial" w:eastAsia="Times New Roman" w:hAnsi="Arial" w:cs="Arial"/>
-          <w:color w:val="222222"/>
-          <w:kern w:val="0"/>
-          <w:sz w:val="24"/>
-          <w:szCs w:val="24"/>
-          <w:lang w:eastAsia="it-IT"/>
-          <w14:ligatures w14:val="none"/>
-        </w:rPr>
-        <w:t>Collaborazioni:</w:t>
+      <w:proofErr w:type="spellStart"/>
+      <w:r>
+        <w:rPr>
+          <w:rFonts w:ascii="Arial" w:eastAsia="Times New Roman" w:hAnsi="Arial" w:cs="Arial"/>
+          <w:color w:val="222222"/>
+          <w:kern w:val="0"/>
+          <w:sz w:val="24"/>
+          <w:szCs w:val="24"/>
+          <w:lang w:val="en-GB" w:eastAsia="it-IT"/>
+          <w14:ligatures w14:val="none"/>
+        </w:rPr>
+        <w:t>Collaborazioni</w:t>
+      </w:r>
+      <w:proofErr w:type="spellEnd"/>
+      <w:r>
+        <w:rPr>
+          <w:rFonts w:ascii="Arial" w:eastAsia="Times New Roman" w:hAnsi="Arial" w:cs="Arial"/>
+          <w:color w:val="222222"/>
+          <w:kern w:val="0"/>
+          <w:sz w:val="24"/>
+          <w:szCs w:val="24"/>
+          <w:lang w:val="en-GB" w:eastAsia="it-IT"/>
+          <w14:ligatures w14:val="none"/>
+        </w:rPr>
+        <w:t>:</w:t>
       </w:r>
     </w:p>
     <w:p>
@@ -39,7 +53,7 @@
           <w:kern w:val="0"/>
           <w:sz w:val="24"/>
           <w:szCs w:val="24"/>
-          <w:lang w:eastAsia="it-IT"/>
+          <w:lang w:val="en-GB" w:eastAsia="it-IT"/>
           <w14:ligatures w14:val="none"/>
         </w:rPr>
       </w:pPr>
@@ -50,7 +64,7 @@
           <w:kern w:val="0"/>
           <w:sz w:val="24"/>
           <w:szCs w:val="24"/>
-          <w:lang w:eastAsia="it-IT"/>
+          <w:lang w:val="en-GB" w:eastAsia="it-IT"/>
           <w14:ligatures w14:val="none"/>
         </w:rPr>
         <w:t>- "Dolores" - Andrea Rock (Virgin Radio)</w:t>
@@ -66,7 +80,7 @@
           <w:kern w:val="0"/>
           <w:sz w:val="24"/>
           <w:szCs w:val="24"/>
-          <w:lang w:eastAsia="it-IT"/>
+          <w:lang w:val="en-GB" w:eastAsia="it-IT"/>
           <w14:ligatures w14:val="none"/>
         </w:rPr>
       </w:pPr>
@@ -77,7 +91,7 @@
           <w:kern w:val="0"/>
           <w:sz w:val="24"/>
           <w:szCs w:val="24"/>
-          <w:lang w:eastAsia="it-IT"/>
+          <w:lang w:val="en-GB" w:eastAsia="it-IT"/>
           <w14:ligatures w14:val="none"/>
         </w:rPr>
         <w:t>- UB4 "Irish Rock Night"</w:t>
@@ -107,8 +121,22 @@
           <w:lang w:eastAsia="it-IT"/>
           <w14:ligatures w14:val="none"/>
         </w:rPr>
-        <w:t>- Cranberries Italia Fanclub per il progetto "Italia Loves Limerick" fundrising</w:t>
-      </w:r>
+        <w:t xml:space="preserve">- Cranberries Italia Fanclub per il progetto "Italia Loves Limerick" </w:t>
+      </w:r>
+      <w:proofErr w:type="spellStart"/>
+      <w:r>
+        <w:rPr>
+          <w:rFonts w:ascii="Arial" w:eastAsia="Times New Roman" w:hAnsi="Arial" w:cs="Arial"/>
+          <w:color w:val="222222"/>
+          <w:kern w:val="0"/>
+          <w:sz w:val="24"/>
+          <w:szCs w:val="24"/>
+          <w:lang w:eastAsia="it-IT"/>
+          <w14:ligatures w14:val="none"/>
+        </w:rPr>
+        <w:t>fundrising</w:t>
+      </w:r>
+      <w:proofErr w:type="spellEnd"/>
     </w:p>
     <w:p>
       <w:pPr>
@@ -162,21 +190,35 @@
           <w:kern w:val="0"/>
           <w:sz w:val="24"/>
           <w:szCs w:val="24"/>
-          <w:lang w:eastAsia="it-IT"/>
+          <w:lang w:val="en-GB" w:eastAsia="it-IT"/>
           <w14:ligatures w14:val="none"/>
         </w:rPr>
       </w:pPr>
-      <w:r>
-        <w:rPr>
-          <w:rFonts w:ascii="Arial" w:eastAsia="Times New Roman" w:hAnsi="Arial" w:cs="Arial"/>
-          <w:color w:val="222222"/>
-          <w:kern w:val="0"/>
-          <w:sz w:val="24"/>
-          <w:szCs w:val="24"/>
-          <w:lang w:eastAsia="it-IT"/>
-          <w14:ligatures w14:val="none"/>
-        </w:rPr>
-        <w:t>Agenzie:</w:t>
+      <w:proofErr w:type="spellStart"/>
+      <w:r>
+        <w:rPr>
+          <w:rFonts w:ascii="Arial" w:eastAsia="Times New Roman" w:hAnsi="Arial" w:cs="Arial"/>
+          <w:color w:val="222222"/>
+          <w:kern w:val="0"/>
+          <w:sz w:val="24"/>
+          <w:szCs w:val="24"/>
+          <w:lang w:val="en-GB" w:eastAsia="it-IT"/>
+          <w14:ligatures w14:val="none"/>
+        </w:rPr>
+        <w:t>Agenzie</w:t>
+      </w:r>
+      <w:proofErr w:type="spellEnd"/>
+      <w:r>
+        <w:rPr>
+          <w:rFonts w:ascii="Arial" w:eastAsia="Times New Roman" w:hAnsi="Arial" w:cs="Arial"/>
+          <w:color w:val="222222"/>
+          <w:kern w:val="0"/>
+          <w:sz w:val="24"/>
+          <w:szCs w:val="24"/>
+          <w:lang w:val="en-GB" w:eastAsia="it-IT"/>
+          <w14:ligatures w14:val="none"/>
+        </w:rPr>
+        <w:t>:</w:t>
       </w:r>
     </w:p>
     <w:p>
@@ -189,7 +231,7 @@
           <w:kern w:val="0"/>
           <w:sz w:val="24"/>
           <w:szCs w:val="24"/>
-          <w:lang w:eastAsia="it-IT"/>
+          <w:lang w:val="en-GB" w:eastAsia="it-IT"/>
           <w14:ligatures w14:val="none"/>
         </w:rPr>
       </w:pPr>
@@ -200,7 +242,7 @@
           <w:kern w:val="0"/>
           <w:sz w:val="24"/>
           <w:szCs w:val="24"/>
-          <w:lang w:eastAsia="it-IT"/>
+          <w:lang w:val="en-GB" w:eastAsia="it-IT"/>
           <w14:ligatures w14:val="none"/>
         </w:rPr>
         <w:t>- Key Events Service (Italy and Belgium)</w:t>
@@ -216,7 +258,7 @@
           <w:kern w:val="0"/>
           <w:sz w:val="24"/>
           <w:szCs w:val="24"/>
-          <w:lang w:eastAsia="it-IT"/>
+          <w:lang w:val="en-GB" w:eastAsia="it-IT"/>
           <w14:ligatures w14:val="none"/>
         </w:rPr>
       </w:pPr>
@@ -227,7 +269,7 @@
           <w:kern w:val="0"/>
           <w:sz w:val="24"/>
           <w:szCs w:val="24"/>
-          <w:lang w:eastAsia="it-IT"/>
+          <w:lang w:val="en-GB" w:eastAsia="it-IT"/>
           <w14:ligatures w14:val="none"/>
         </w:rPr>
         <w:t>   Star's Garden (Italy)</w:t>
@@ -243,7 +285,7 @@
           <w:kern w:val="0"/>
           <w:sz w:val="24"/>
           <w:szCs w:val="24"/>
-          <w:lang w:eastAsia="it-IT"/>
+          <w:lang w:val="en-GB" w:eastAsia="it-IT"/>
           <w14:ligatures w14:val="none"/>
         </w:rPr>
       </w:pPr>
@@ -254,10 +296,62 @@
           <w:kern w:val="0"/>
           <w:sz w:val="24"/>
           <w:szCs w:val="24"/>
-          <w:lang w:eastAsia="it-IT"/>
-          <w14:ligatures w14:val="none"/>
-        </w:rPr>
-        <w:t>- Schennach ( Austria, Germany, Switzerland)</w:t>
+          <w:lang w:val="en-GB" w:eastAsia="it-IT"/>
+          <w14:ligatures w14:val="none"/>
+        </w:rPr>
+        <w:t xml:space="preserve">- </w:t>
+      </w:r>
+      <w:proofErr w:type="spellStart"/>
+      <w:r>
+        <w:rPr>
+          <w:rFonts w:ascii="Arial" w:eastAsia="Times New Roman" w:hAnsi="Arial" w:cs="Arial"/>
+          <w:color w:val="222222"/>
+          <w:kern w:val="0"/>
+          <w:sz w:val="24"/>
+          <w:szCs w:val="24"/>
+          <w:lang w:val="en-GB" w:eastAsia="it-IT"/>
+          <w14:ligatures w14:val="none"/>
+        </w:rPr>
+        <w:t>Schennach</w:t>
+      </w:r>
+      <w:proofErr w:type="spellEnd"/>
+      <w:r>
+        <w:rPr>
+          <w:rFonts w:ascii="Arial" w:eastAsia="Times New Roman" w:hAnsi="Arial" w:cs="Arial"/>
+          <w:color w:val="222222"/>
+          <w:kern w:val="0"/>
+          <w:sz w:val="24"/>
+          <w:szCs w:val="24"/>
+          <w:lang w:val="en-GB" w:eastAsia="it-IT"/>
+          <w14:ligatures w14:val="none"/>
+        </w:rPr>
+        <w:t xml:space="preserve"> </w:t>
+      </w:r>
+      <w:proofErr w:type="gramStart"/>
+      <w:r>
+        <w:rPr>
+          <w:rFonts w:ascii="Arial" w:eastAsia="Times New Roman" w:hAnsi="Arial" w:cs="Arial"/>
+          <w:color w:val="222222"/>
+          <w:kern w:val="0"/>
+          <w:sz w:val="24"/>
+          <w:szCs w:val="24"/>
+          <w:lang w:val="en-GB" w:eastAsia="it-IT"/>
+          <w14:ligatures w14:val="none"/>
+        </w:rPr>
+        <w:t>( Austria</w:t>
+      </w:r>
+      <w:proofErr w:type="gramEnd"/>
+      <w:r>
+        <w:rPr>
+          <w:rFonts w:ascii="Arial" w:eastAsia="Times New Roman" w:hAnsi="Arial" w:cs="Arial"/>
+          <w:color w:val="222222"/>
+          <w:kern w:val="0"/>
+          <w:sz w:val="24"/>
+          <w:szCs w:val="24"/>
+          <w:lang w:val="en-GB" w:eastAsia="it-IT"/>
+          <w14:ligatures w14:val="none"/>
+        </w:rPr>
+        <w:t>, Germany, Switzerland)</w:t>
       </w:r>
     </w:p>
     <w:p>
@@ -270,7 +364,7 @@
           <w:kern w:val="0"/>
           <w:sz w:val="24"/>
           <w:szCs w:val="24"/>
-          <w:lang w:eastAsia="it-IT"/>
+          <w:lang w:val="en-GB" w:eastAsia="it-IT"/>
           <w14:ligatures w14:val="none"/>
         </w:rPr>
       </w:pPr>
@@ -281,7 +375,7 @@
           <w:kern w:val="0"/>
           <w:sz w:val="24"/>
           <w:szCs w:val="24"/>
-          <w:lang w:eastAsia="it-IT"/>
+          <w:lang w:val="en-GB" w:eastAsia="it-IT"/>
           <w14:ligatures w14:val="none"/>
         </w:rPr>
         <w:t>- Art Events (Croatia)</w:t>
@@ -297,7 +391,7 @@
           <w:kern w:val="0"/>
           <w:sz w:val="24"/>
           <w:szCs w:val="24"/>
-          <w:lang w:eastAsia="it-IT"/>
+          <w:lang w:val="en-GB" w:eastAsia="it-IT"/>
           <w14:ligatures w14:val="none"/>
         </w:rPr>
       </w:pPr>
@@ -308,13 +402,393 @@
           <w:kern w:val="0"/>
           <w:sz w:val="24"/>
           <w:szCs w:val="24"/>
-          <w:lang w:eastAsia="it-IT"/>
+          <w:lang w:val="en-GB" w:eastAsia="it-IT"/>
           <w14:ligatures w14:val="none"/>
         </w:rPr>
         <w:t>- Cathal Dolan &amp; Tracey (Ireland)</w:t>
       </w:r>
     </w:p>
-    <w:p/>
+    <w:p>
+      <w:pPr>
+        <w:shd w:val="clear" w:color="auto" w:fill="FFFFFF"/>
+        <w:spacing w:after="0" w:line="240" w:lineRule="auto"/>
+        <w:rPr>
+          <w:rFonts w:ascii="Arial" w:eastAsia="Times New Roman" w:hAnsi="Arial" w:cs="Arial"/>
+          <w:color w:val="222222"/>
+          <w:kern w:val="0"/>
+          <w:sz w:val="24"/>
+          <w:szCs w:val="24"/>
+          <w:lang w:val="en-GB" w:eastAsia="it-IT"/>
+          <w14:ligatures w14:val="none"/>
+        </w:rPr>
+      </w:pPr>
+    </w:p>
+    <w:p>
+      <w:pPr>
+        <w:shd w:val="clear" w:color="auto" w:fill="FFFFFF"/>
+        <w:spacing w:after="0" w:line="240" w:lineRule="auto"/>
+        <w:rPr>
+          <w:rFonts w:ascii="Arial" w:eastAsia="Times New Roman" w:hAnsi="Arial" w:cs="Arial"/>
+          <w:color w:val="222222"/>
+          <w:kern w:val="0"/>
+          <w:sz w:val="24"/>
+          <w:szCs w:val="24"/>
+          <w:lang w:val="en-GB" w:eastAsia="it-IT"/>
+          <w14:ligatures w14:val="none"/>
+        </w:rPr>
+      </w:pPr>
+    </w:p>
+    <w:p>
+      <w:pPr>
+        <w:shd w:val="clear" w:color="auto" w:fill="FFFFFF"/>
+        <w:spacing w:after="0" w:line="240" w:lineRule="auto"/>
+        <w:rPr>
+          <w:rFonts w:ascii="Arial" w:eastAsia="Times New Roman" w:hAnsi="Arial" w:cs="Arial"/>
+          <w:color w:val="222222"/>
+          <w:kern w:val="0"/>
+          <w:sz w:val="24"/>
+          <w:szCs w:val="24"/>
+          <w:lang w:val="en-GB" w:eastAsia="it-IT"/>
+          <w14:ligatures w14:val="none"/>
+        </w:rPr>
+      </w:pPr>
+    </w:p>
+    <w:p>
+      <w:pPr>
+        <w:shd w:val="clear" w:color="auto" w:fill="FFFFFF"/>
+        <w:spacing w:after="0" w:line="240" w:lineRule="auto"/>
+        <w:rPr>
+          <w:rFonts w:ascii="Arial" w:eastAsia="Times New Roman" w:hAnsi="Arial" w:cs="Arial"/>
+          <w:color w:val="222222"/>
+          <w:kern w:val="0"/>
+          <w:sz w:val="24"/>
+          <w:szCs w:val="24"/>
+          <w:lang w:val="en-GB" w:eastAsia="it-IT"/>
+          <w14:ligatures w14:val="none"/>
+        </w:rPr>
+      </w:pPr>
+      <w:r>
+        <w:rPr>
+          <w:rFonts w:ascii="Arial" w:eastAsia="Times New Roman" w:hAnsi="Arial" w:cs="Arial"/>
+          <w:color w:val="222222"/>
+          <w:kern w:val="0"/>
+          <w:sz w:val="24"/>
+          <w:szCs w:val="24"/>
+          <w:lang w:val="en-GB" w:eastAsia="it-IT"/>
+          <w14:ligatures w14:val="none"/>
+        </w:rPr>
+        <w:t xml:space="preserve">Account </w:t>
+      </w:r>
+      <w:proofErr w:type="spellStart"/>
+      <w:r>
+        <w:rPr>
+          <w:rFonts w:ascii="Arial" w:eastAsia="Times New Roman" w:hAnsi="Arial" w:cs="Arial"/>
+          <w:color w:val="222222"/>
+          <w:kern w:val="0"/>
+          <w:sz w:val="24"/>
+          <w:szCs w:val="24"/>
+          <w:lang w:val="en-GB" w:eastAsia="it-IT"/>
+          <w14:ligatures w14:val="none"/>
+        </w:rPr>
+        <w:t>agganciati</w:t>
+      </w:r>
+      <w:proofErr w:type="spellEnd"/>
+      <w:r>
+        <w:rPr>
+          <w:rFonts w:ascii="Arial" w:eastAsia="Times New Roman" w:hAnsi="Arial" w:cs="Arial"/>
+          <w:color w:val="222222"/>
+          <w:kern w:val="0"/>
+          <w:sz w:val="24"/>
+          <w:szCs w:val="24"/>
+          <w:lang w:val="en-GB" w:eastAsia="it-IT"/>
+          <w14:ligatures w14:val="none"/>
+        </w:rPr>
+        <w:t>:</w:t>
+      </w:r>
+    </w:p>
+    <w:p>
+      <w:pPr>
+        <w:shd w:val="clear" w:color="auto" w:fill="FFFFFF"/>
+        <w:spacing w:after="0" w:line="240" w:lineRule="auto"/>
+        <w:rPr>
+          <w:rFonts w:ascii="Arial" w:eastAsia="Times New Roman" w:hAnsi="Arial" w:cs="Arial"/>
+          <w:color w:val="222222"/>
+          <w:kern w:val="0"/>
+          <w:sz w:val="24"/>
+          <w:szCs w:val="24"/>
+          <w:lang w:val="en-GB" w:eastAsia="it-IT"/>
+          <w14:ligatures w14:val="none"/>
+        </w:rPr>
+      </w:pPr>
+    </w:p>
+    <w:p>
+      <w:pPr>
+        <w:shd w:val="clear" w:color="auto" w:fill="FFFFFF"/>
+        <w:spacing w:after="0" w:line="240" w:lineRule="auto"/>
+        <w:rPr>
+          <w:rFonts w:ascii="Arial" w:eastAsia="Times New Roman" w:hAnsi="Arial" w:cs="Arial"/>
+          <w:color w:val="222222"/>
+          <w:kern w:val="0"/>
+          <w:sz w:val="24"/>
+          <w:szCs w:val="24"/>
+          <w:lang w:val="en-GB" w:eastAsia="it-IT"/>
+          <w14:ligatures w14:val="none"/>
+        </w:rPr>
+      </w:pPr>
+      <w:r>
+        <w:rPr>
+          <w:rFonts w:ascii="Arial" w:eastAsia="Times New Roman" w:hAnsi="Arial" w:cs="Arial"/>
+          <w:color w:val="222222"/>
+          <w:kern w:val="0"/>
+          <w:sz w:val="24"/>
+          <w:szCs w:val="24"/>
+          <w:lang w:val="en-GB" w:eastAsia="it-IT"/>
+          <w14:ligatures w14:val="none"/>
+        </w:rPr>
+        <w:t xml:space="preserve">Per </w:t>
+      </w:r>
+      <w:proofErr w:type="spellStart"/>
+      <w:r>
+        <w:rPr>
+          <w:rFonts w:ascii="Arial" w:eastAsia="Times New Roman" w:hAnsi="Arial" w:cs="Arial"/>
+          <w:color w:val="222222"/>
+          <w:kern w:val="0"/>
+          <w:sz w:val="24"/>
+          <w:szCs w:val="24"/>
+          <w:lang w:val="en-GB" w:eastAsia="it-IT"/>
+          <w14:ligatures w14:val="none"/>
+        </w:rPr>
+        <w:t>creare</w:t>
+      </w:r>
+      <w:proofErr w:type="spellEnd"/>
+      <w:r>
+        <w:rPr>
+          <w:rFonts w:ascii="Arial" w:eastAsia="Times New Roman" w:hAnsi="Arial" w:cs="Arial"/>
+          <w:color w:val="222222"/>
+          <w:kern w:val="0"/>
+          <w:sz w:val="24"/>
+          <w:szCs w:val="24"/>
+          <w:lang w:val="en-GB" w:eastAsia="it-IT"/>
+          <w14:ligatures w14:val="none"/>
+        </w:rPr>
+        <w:t xml:space="preserve"> </w:t>
+      </w:r>
+      <w:proofErr w:type="spellStart"/>
+      <w:r>
+        <w:rPr>
+          <w:rFonts w:ascii="Arial" w:eastAsia="Times New Roman" w:hAnsi="Arial" w:cs="Arial"/>
+          <w:color w:val="222222"/>
+          <w:kern w:val="0"/>
+          <w:sz w:val="24"/>
+          <w:szCs w:val="24"/>
+          <w:lang w:val="en-GB" w:eastAsia="it-IT"/>
+          <w14:ligatures w14:val="none"/>
+        </w:rPr>
+        <w:t>eventi</w:t>
+      </w:r>
+      <w:proofErr w:type="spellEnd"/>
+      <w:r>
+        <w:rPr>
+          <w:rFonts w:ascii="Arial" w:eastAsia="Times New Roman" w:hAnsi="Arial" w:cs="Arial"/>
+          <w:color w:val="222222"/>
+          <w:kern w:val="0"/>
+          <w:sz w:val="24"/>
+          <w:szCs w:val="24"/>
+          <w:lang w:val="en-GB" w:eastAsia="it-IT"/>
+          <w14:ligatures w14:val="none"/>
+        </w:rPr>
+        <w:t xml:space="preserve"> (bands in to</w:t>
+      </w:r>
+      <w:r>
+        <w:rPr>
+          <w:rFonts w:ascii="Arial" w:eastAsia="Times New Roman" w:hAnsi="Arial" w:cs="Arial"/>
+          <w:color w:val="222222"/>
+          <w:kern w:val="0"/>
+          <w:sz w:val="24"/>
+          <w:szCs w:val="24"/>
+          <w:lang w:val="en-GB" w:eastAsia="it-IT"/>
+          <w14:ligatures w14:val="none"/>
+        </w:rPr>
+        <w:t>wn):</w:t>
+      </w:r>
+    </w:p>
+    <w:tbl>
+      <w:tblPr>
+        <w:tblW w:w="0" w:type="dxa"/>
+        <w:tblCellMar>
+          <w:left w:w="0" w:type="dxa"/>
+          <w:right w:w="0" w:type="dxa"/>
+        </w:tblCellMar>
+        <w:tblLook w:val="04A0" w:firstRow="1" w:lastRow="0" w:firstColumn="1" w:lastColumn="0" w:noHBand="0" w:noVBand="1"/>
+      </w:tblPr>
+      <w:tblGrid>
+        <w:gridCol w:w="3314"/>
+        <w:gridCol w:w="2283"/>
+        <w:gridCol w:w="1124"/>
+      </w:tblGrid>
+      <w:tr>
+        <w:trPr>
+          <w:trHeight w:val="315"/>
+        </w:trPr>
+        <w:tc>
+          <w:tcPr>
+            <w:tcW w:w="0" w:type="auto"/>
+            <w:tcBorders>
+              <w:top w:val="single" w:sz="6" w:space="0" w:color="CCCCCC"/>
+              <w:left w:val="single" w:sz="6" w:space="0" w:color="CCCCCC"/>
+              <w:bottom w:val="single" w:sz="6" w:space="0" w:color="CCCCCC"/>
+              <w:right w:val="single" w:sz="6" w:space="0" w:color="CCCCCC"/>
+            </w:tcBorders>
+            <w:tcMar>
+              <w:top w:w="30" w:type="dxa"/>
+              <w:left w:w="45" w:type="dxa"/>
+              <w:bottom w:w="30" w:type="dxa"/>
+              <w:right w:w="45" w:type="dxa"/>
+            </w:tcMar>
+            <w:vAlign w:val="bottom"/>
+            <w:hideMark/>
+          </w:tcPr>
+          <w:p>
+            <w:pPr>
+              <w:spacing w:after="0" w:line="240" w:lineRule="auto"/>
+              <w:rPr>
+                <w:rFonts w:ascii="Arial" w:eastAsia="Times New Roman" w:hAnsi="Arial" w:cs="Arial"/>
+                <w:color w:val="1155CC"/>
+                <w:kern w:val="0"/>
+                <w:sz w:val="20"/>
+                <w:szCs w:val="20"/>
+                <w:u w:val="single"/>
+                <w:lang w:val="en-GB" w:eastAsia="it-IT"/>
+                <w14:ligatures w14:val="none"/>
+              </w:rPr>
+            </w:pPr>
+            <w:hyperlink r:id="rId4" w:tgtFrame="_blank" w:history="1">
+              <w:r>
+                <w:rPr>
+                  <w:rFonts w:ascii="Arial" w:eastAsia="Times New Roman" w:hAnsi="Arial" w:cs="Arial"/>
+                  <w:color w:val="0000FF"/>
+                  <w:kern w:val="0"/>
+                  <w:sz w:val="20"/>
+                  <w:szCs w:val="20"/>
+                  <w:u w:val="single"/>
+                  <w:lang w:val="en-GB" w:eastAsia="it-IT"/>
+                  <w14:ligatures w14:val="none"/>
+                </w:rPr>
+                <w:t>https://artists.bandsintown.com/login</w:t>
+              </w:r>
+            </w:hyperlink>
+          </w:p>
+        </w:tc>
+        <w:tc>
+          <w:tcPr>
+            <w:tcW w:w="0" w:type="auto"/>
+            <w:tcBorders>
+              <w:top w:val="single" w:sz="6" w:space="0" w:color="CCCCCC"/>
+              <w:left w:val="single" w:sz="6" w:space="0" w:color="CCCCCC"/>
+              <w:bottom w:val="single" w:sz="6" w:space="0" w:color="CCCCCC"/>
+              <w:right w:val="single" w:sz="6" w:space="0" w:color="CCCCCC"/>
+            </w:tcBorders>
+            <w:tcMar>
+              <w:top w:w="30" w:type="dxa"/>
+              <w:left w:w="45" w:type="dxa"/>
+              <w:bottom w:w="30" w:type="dxa"/>
+              <w:right w:w="45" w:type="dxa"/>
+            </w:tcMar>
+            <w:vAlign w:val="bottom"/>
+            <w:hideMark/>
+          </w:tcPr>
+          <w:p>
+            <w:pPr>
+              <w:spacing w:after="0" w:line="240" w:lineRule="auto"/>
+              <w:rPr>
+                <w:rFonts w:ascii="Arial" w:eastAsia="Times New Roman" w:hAnsi="Arial" w:cs="Arial"/>
+                <w:kern w:val="0"/>
+                <w:sz w:val="20"/>
+                <w:szCs w:val="20"/>
+                <w:lang w:eastAsia="it-IT"/>
+                <w14:ligatures w14:val="none"/>
+              </w:rPr>
+            </w:pPr>
+            <w:r>
+              <w:rPr>
+                <w:rFonts w:ascii="Arial" w:eastAsia="Times New Roman" w:hAnsi="Arial" w:cs="Arial"/>
+                <w:kern w:val="0"/>
+                <w:sz w:val="20"/>
+                <w:szCs w:val="20"/>
+                <w:lang w:eastAsia="it-IT"/>
+                <w14:ligatures w14:val="none"/>
+              </w:rPr>
+              <w:t>thelizberries@gmail.com</w:t>
+            </w:r>
+          </w:p>
+        </w:tc>
+        <w:tc>
+          <w:tcPr>
+            <w:tcW w:w="0" w:type="auto"/>
+            <w:tcBorders>
+              <w:top w:val="single" w:sz="6" w:space="0" w:color="CCCCCC"/>
+              <w:left w:val="single" w:sz="6" w:space="0" w:color="CCCCCC"/>
+              <w:bottom w:val="single" w:sz="6" w:space="0" w:color="CCCCCC"/>
+              <w:right w:val="single" w:sz="6" w:space="0" w:color="CCCCCC"/>
+            </w:tcBorders>
+            <w:tcMar>
+              <w:top w:w="30" w:type="dxa"/>
+              <w:left w:w="45" w:type="dxa"/>
+              <w:bottom w:w="30" w:type="dxa"/>
+              <w:right w:w="45" w:type="dxa"/>
+            </w:tcMar>
+            <w:vAlign w:val="bottom"/>
+            <w:hideMark/>
+          </w:tcPr>
+          <w:p>
+            <w:pPr>
+              <w:spacing w:after="0" w:line="240" w:lineRule="auto"/>
+              <w:rPr>
+                <w:rFonts w:ascii="Arial" w:eastAsia="Times New Roman" w:hAnsi="Arial" w:cs="Arial"/>
+                <w:kern w:val="0"/>
+                <w:sz w:val="20"/>
+                <w:szCs w:val="20"/>
+                <w:lang w:eastAsia="it-IT"/>
+                <w14:ligatures w14:val="none"/>
+              </w:rPr>
+            </w:pPr>
+            <w:r>
+              <w:rPr>
+                <w:rFonts w:ascii="Arial" w:eastAsia="Times New Roman" w:hAnsi="Arial" w:cs="Arial"/>
+                <w:kern w:val="0"/>
+                <w:sz w:val="20"/>
+                <w:szCs w:val="20"/>
+                <w:lang w:eastAsia="it-IT"/>
+                <w14:ligatures w14:val="none"/>
+              </w:rPr>
+              <w:t>20Mirtilli24*</w:t>
+            </w:r>
+          </w:p>
+        </w:tc>
+      </w:tr>
+    </w:tbl>
+    <w:p>
+      <w:pPr>
+        <w:shd w:val="clear" w:color="auto" w:fill="FFFFFF"/>
+        <w:spacing w:after="0" w:line="240" w:lineRule="auto"/>
+        <w:rPr>
+          <w:rFonts w:ascii="Arial" w:eastAsia="Times New Roman" w:hAnsi="Arial" w:cs="Arial"/>
+          <w:color w:val="222222"/>
+          <w:kern w:val="0"/>
+          <w:sz w:val="24"/>
+          <w:szCs w:val="24"/>
+          <w:lang w:val="en-GB" w:eastAsia="it-IT"/>
+          <w14:ligatures w14:val="none"/>
+        </w:rPr>
+      </w:pPr>
+    </w:p>
+    <w:p>
+      <w:pPr>
+        <w:rPr>
+          <w:lang w:val="en-GB"/>
+        </w:rPr>
+      </w:pPr>
+    </w:p>
     <w:sectPr>
       <w:pgSz w:w="11906" w:h="16838"/>
       <w:pgMar w:top="1417" w:right="1134" w:bottom="1134" w:left="1134" w:header="708" w:footer="708" w:gutter="0"/>
@@ -1242,6 +1716,18 @@
       <w:spacing w:val="5"/>
     </w:rPr>
   </w:style>
+  <w:style w:type="character" w:styleId="Collegamentoipertestuale">
+    <w:name w:val="Hyperlink"/>
+    <w:basedOn w:val="Carpredefinitoparagrafo"/>
+    <w:uiPriority w:val="99"/>
+    <w:semiHidden/>
+    <w:unhideWhenUsed/>
+    <w:rsid w:val="00D50496"/>
+    <w:rPr>
+      <w:color w:val="0000FF"/>
+      <w:u w:val="single"/>
+    </w:rPr>
+  </w:style>
 </w:styles>
 </file>
 

</xml_diff>